<commit_message>
Actualiza documentos ITCA II: informes 020-030, actas extraordinarias 001-003 y formato ITCA
Co-Authored-By: Claude Opus 5.5 <noreply@anthropic.com>
</commit_message>
<xml_diff>
--- a/ITCA 2/INFORME Nº.docx
+++ b/ITCA 2/INFORME Nº.docx
@@ -17,25 +17,23 @@
           <w:b/>
           <w:bCs/>
         </w:rPr>
-        <w:t xml:space="preserve">INFORME </w:t>
-      </w:r>
-      <w:proofErr w:type="spellStart"/>
+        <w:t xml:space="preserve">INFORME Nº </w:t>
+      </w:r>
       <w:r>
         <w:rPr>
           <w:rFonts w:ascii="Arial" w:hAnsi="Arial" w:cs="Arial"/>
           <w:b/>
           <w:bCs/>
         </w:rPr>
-        <w:t>Nº</w:t>
-      </w:r>
-      <w:proofErr w:type="spellEnd"/>
+        <w:t>1</w:t>
+      </w:r>
       <w:r>
         <w:rPr>
           <w:rFonts w:ascii="Arial" w:hAnsi="Arial" w:cs="Arial"/>
           <w:b/>
           <w:bCs/>
         </w:rPr>
-        <w:t xml:space="preserve"> </w:t>
+        <w:t>5</w:t>
       </w:r>
       <w:r>
         <w:rPr>
@@ -43,7 +41,7 @@
           <w:b/>
           <w:bCs/>
         </w:rPr>
-        <w:t>65</w:t>
+        <w:t xml:space="preserve"> - 202</w:t>
       </w:r>
       <w:r>
         <w:rPr>
@@ -51,7 +49,15 @@
           <w:b/>
           <w:bCs/>
         </w:rPr>
-        <w:t xml:space="preserve"> - 2025-ST-CODISEC/MDCH</w:t>
+        <w:t>6</w:t>
+      </w:r>
+      <w:r>
+        <w:rPr>
+          <w:rFonts w:ascii="Arial" w:hAnsi="Arial" w:cs="Arial"/>
+          <w:b/>
+          <w:bCs/>
+        </w:rPr>
+        <w:t>-ST-CODISEC/MDCH</w:t>
       </w:r>
     </w:p>
     <w:p>
@@ -162,7 +168,7 @@
           <w:rFonts w:ascii="Arial" w:hAnsi="Arial" w:cs="Arial"/>
         </w:rPr>
         <w:pict w14:anchorId="072045CF">
-          <v:rect id="_x0000_i1027" style="width:0;height:1.5pt" o:hralign="center" o:hrstd="t" o:hr="t" fillcolor="#a0a0a0" stroked="f"/>
+          <v:rect id="_x0000_i1025" style="width:0;height:1.5pt" o:hralign="center" o:hrstd="t" o:hr="t" fillcolor="#a0a0a0" stroked="f"/>
         </w:pict>
       </w:r>
     </w:p>
@@ -201,21 +207,7 @@
         <w:rPr>
           <w:rFonts w:ascii="Arial" w:hAnsi="Arial" w:cs="Arial"/>
         </w:rPr>
-        <w:t xml:space="preserve">, se llevó a cabo la charla preventiva programada en el marco de la Línea de Acción </w:t>
-      </w:r>
-      <w:proofErr w:type="spellStart"/>
-      <w:r>
-        <w:rPr>
-          <w:rFonts w:ascii="Arial" w:hAnsi="Arial" w:cs="Arial"/>
-        </w:rPr>
-        <w:t>N°</w:t>
-      </w:r>
-      <w:proofErr w:type="spellEnd"/>
-      <w:r>
-        <w:rPr>
-          <w:rFonts w:ascii="Arial" w:hAnsi="Arial" w:cs="Arial"/>
-        </w:rPr>
-        <w:t xml:space="preserve"> 1: Prevención social del delito y las violencias, correspondiente a la actividad estratégica de Prevención y atención de la violencia escolar.</w:t>
+        <w:t>, se llevó a cabo la charla preventiva programada en el marco de la Línea de Acción N° 1: Prevención social del delito y las violencias, correspondiente a la actividad estratégica de Prevención y atención de la violencia escolar.</w:t>
       </w:r>
     </w:p>
     <w:p>

</xml_diff>